<commit_message>
Update the handout 3
Small edits on examples
</commit_message>
<xml_diff>
--- a/handout 3 - actionable checklist.docx
+++ b/handout 3 - actionable checklist.docx
@@ -1,6 +1,6 @@
 
 <file path=word/document.xml><?xml version="1.0" encoding="utf-8"?>
-<w:document xmlns:wpc="http://schemas.microsoft.com/office/word/2010/wordprocessingCanvas" xmlns:cx="http://schemas.microsoft.com/office/drawing/2014/chartex" xmlns:cx1="http://schemas.microsoft.com/office/drawing/2015/9/8/chartex" xmlns:cx2="http://schemas.microsoft.com/office/drawing/2015/10/21/chartex" xmlns:cx3="http://schemas.microsoft.com/office/drawing/2016/5/9/chartex" xmlns:cx4="http://schemas.microsoft.com/office/drawing/2016/5/10/chartex" xmlns:cx5="http://schemas.microsoft.com/office/drawing/2016/5/11/chartex" xmlns:cx6="http://schemas.microsoft.com/office/drawing/2016/5/12/chartex" xmlns:cx7="http://schemas.microsoft.com/office/drawing/2016/5/13/chartex" xmlns:cx8="http://schemas.microsoft.com/office/drawing/2016/5/14/chartex" xmlns:mc="http://schemas.openxmlformats.org/markup-compatibility/2006" xmlns:aink="http://schemas.microsoft.com/office/drawing/2016/ink" xmlns:am3d="http://schemas.microsoft.com/office/drawing/2017/model3d" xmlns:o="urn:schemas-microsoft-com:office:office" xmlns:oel="http://schemas.microsoft.com/office/2019/extlst" xmlns:r="http://schemas.openxmlformats.org/officeDocument/2006/relationships" xmlns:m="http://schemas.openxmlformats.org/officeDocument/2006/math" xmlns:v="urn:schemas-microsoft-com:vml" xmlns:wp14="http://schemas.microsoft.com/office/word/2010/wordprocessingDrawing" xmlns:wp="http://schemas.openxmlformats.org/drawingml/2006/wordprocessingDrawing" xmlns:w10="urn:schemas-microsoft-com:office:word" xmlns:w="http://schemas.openxmlformats.org/wordprocessingml/2006/main" xmlns:w14="http://schemas.microsoft.com/office/word/2010/wordml" xmlns:w15="http://schemas.microsoft.com/office/word/2012/wordml" xmlns:w16cei="http://schemas.microsoft.com/office/word/2026/wordml/cei" xmlns:w16cex="http://schemas.microsoft.com/office/word/2018/wordml/cex" xmlns:w16cid="http://schemas.microsoft.com/office/word/2016/wordml/cid" xmlns:w16="http://schemas.microsoft.com/office/word/2018/wordml" xmlns:w16du="http://schemas.microsoft.com/office/word/2023/wordml/word16du" xmlns:w16sdtdh="http://schemas.microsoft.com/office/word/2020/wordml/sdtdatahash" xmlns:w16sdtfl="http://schemas.microsoft.com/office/word/2024/wordml/sdtformatlock" xmlns:w16se="http://schemas.microsoft.com/office/word/2015/wordml/symex" xmlns:wpg="http://schemas.microsoft.com/office/word/2010/wordprocessingGroup" xmlns:wpi="http://schemas.microsoft.com/office/word/2010/wordprocessingInk" xmlns:wne="http://schemas.microsoft.com/office/word/2006/wordml" xmlns:wps="http://schemas.microsoft.com/office/word/2010/wordprocessingShape" mc:Ignorable="w14 w15 w16se w16cid w16 w16cex w16sdtdh w16sdtfl w16du wp14">
+<w:document xmlns:wpc="http://schemas.microsoft.com/office/word/2010/wordprocessingCanvas" xmlns:cx="http://schemas.microsoft.com/office/drawing/2014/chartex" xmlns:cx1="http://schemas.microsoft.com/office/drawing/2015/9/8/chartex" xmlns:cx2="http://schemas.microsoft.com/office/drawing/2015/10/21/chartex" xmlns:cx3="http://schemas.microsoft.com/office/drawing/2016/5/9/chartex" xmlns:cx4="http://schemas.microsoft.com/office/drawing/2016/5/10/chartex" xmlns:cx5="http://schemas.microsoft.com/office/drawing/2016/5/11/chartex" xmlns:cx6="http://schemas.microsoft.com/office/drawing/2016/5/12/chartex" xmlns:cx7="http://schemas.microsoft.com/office/drawing/2016/5/13/chartex" xmlns:cx8="http://schemas.microsoft.com/office/drawing/2016/5/14/chartex" xmlns:mc="http://schemas.openxmlformats.org/markup-compatibility/2006" xmlns:aink="http://schemas.microsoft.com/office/drawing/2016/ink" xmlns:am3d="http://schemas.microsoft.com/office/drawing/2017/model3d" xmlns:o="urn:schemas-microsoft-com:office:office" xmlns:oel="http://schemas.microsoft.com/office/2019/extlst" xmlns:r="http://schemas.openxmlformats.org/officeDocument/2006/relationships" xmlns:m="http://schemas.openxmlformats.org/officeDocument/2006/math" xmlns:v="urn:schemas-microsoft-com:vml" xmlns:wp14="http://schemas.microsoft.com/office/word/2010/wordprocessingDrawing" xmlns:wp="http://schemas.openxmlformats.org/drawingml/2006/wordprocessingDrawing" xmlns:w10="urn:schemas-microsoft-com:office:word" xmlns:w="http://schemas.openxmlformats.org/wordprocessingml/2006/main" xmlns:w14="http://schemas.microsoft.com/office/word/2010/wordml" xmlns:w15="http://schemas.microsoft.com/office/word/2012/wordml" xmlns:w16cex="http://schemas.microsoft.com/office/word/2018/wordml/cex" xmlns:w16cid="http://schemas.microsoft.com/office/word/2016/wordml/cid" xmlns:w16="http://schemas.microsoft.com/office/word/2018/wordml" xmlns:w16du="http://schemas.microsoft.com/office/word/2023/wordml/word16du" xmlns:w16sdtdh="http://schemas.microsoft.com/office/word/2020/wordml/sdtdatahash" xmlns:w16sdtfl="http://schemas.microsoft.com/office/word/2024/wordml/sdtformatlock" xmlns:w16se="http://schemas.microsoft.com/office/word/2015/wordml/symex" xmlns:wpg="http://schemas.microsoft.com/office/word/2010/wordprocessingGroup" xmlns:wpi="http://schemas.microsoft.com/office/word/2010/wordprocessingInk" xmlns:wne="http://schemas.microsoft.com/office/word/2006/wordml" xmlns:wps="http://schemas.microsoft.com/office/word/2010/wordprocessingShape" mc:Ignorable="w14 w15 w16se w16cid w16 w16cex w16sdtdh w16sdtfl w16du wp14">
   <w:body>
     <w:p>
       <w:pPr>
@@ -596,12 +596,11 @@
       </w:r>
       <w:r>
         <w:rPr>
-          <w:rFonts w:hint="eastAsia"/>
-          <w:color w:val="1A1A1A"/>
-          <w:sz w:val="24"/>
-          <w:szCs w:val="24"/>
-        </w:rPr>
-        <w:t>LA</w:t>
+          <w:color w:val="1A1A1A"/>
+          <w:sz w:val="24"/>
+          <w:szCs w:val="24"/>
+        </w:rPr>
+        <w:t>SB</w:t>
       </w:r>
       <w:r>
         <w:rPr>
@@ -613,12 +612,11 @@
       </w:r>
       <w:r>
         <w:rPr>
-          <w:rFonts w:hint="eastAsia"/>
-          <w:color w:val="1A1A1A"/>
-          <w:sz w:val="24"/>
-          <w:szCs w:val="24"/>
-        </w:rPr>
-        <w:t>Los Angeles</w:t>
+          <w:color w:val="1A1A1A"/>
+          <w:sz w:val="24"/>
+          <w:szCs w:val="24"/>
+        </w:rPr>
+        <w:t>San Bernardino</w:t>
       </w:r>
       <w:r>
         <w:rPr>
@@ -1049,6 +1047,16 @@
         </w:rPr>
         <w:t xml:space="preserve"> are traceable (what changed, when, and by whom)</w:t>
       </w:r>
+    </w:p>
+    <w:p>
+      <w:pPr>
+        <w:spacing w:after="120"/>
+        <w:ind w:left="346" w:hanging="346"/>
+        <w:rPr>
+          <w:sz w:val="24"/>
+          <w:szCs w:val="24"/>
+        </w:rPr>
+      </w:pPr>
     </w:p>
     <w:p>
       <w:pPr>
@@ -4411,7 +4419,7 @@
               </wp:anchor>
             </w:drawing>
           </mc:Choice>
-          <mc:Fallback>
+          <mc:Fallback xmlns:w16cei="http://schemas.microsoft.com/office/word/2026/wordml/cei">
             <w:pict>
               <v:rect w14:anchorId="64BF64E4" id="Rectangle 1" o:spid="_x0000_s1026" style="position:absolute;margin-left:-11.25pt;margin-top:19.35pt;width:560.45pt;height:186.05pt;z-index:-251657216;visibility:visible;mso-wrap-style:square;mso-wrap-distance-left:9pt;mso-wrap-distance-top:0;mso-wrap-distance-right:9pt;mso-wrap-distance-bottom:0;mso-position-horizontal:absolute;mso-position-horizontal-relative:text;mso-position-vertical:absolute;mso-position-vertical-relative:text;v-text-anchor:middle" o:gfxdata="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" fillcolor="#e8e8e8 [3214]" strokecolor="#030e13 [484]" strokeweight="1pt"/>
             </w:pict>
@@ -4830,7 +4838,7 @@
     </w:p>
     <w:p/>
     <w:sectPr>
-      <w:footerReference w:type="default" r:id="rId4"/>
+      <w:footerReference w:type="default" r:id="rId6"/>
       <w:pgSz w:w="12240" w:h="15840"/>
       <w:pgMar w:top="720" w:right="720" w:bottom="720" w:left="720" w:header="708" w:footer="708" w:gutter="0"/>
       <w:cols w:space="720"/>
@@ -4840,8 +4848,27 @@
 </w:document>
 </file>
 
+<file path=word/endnotes.xml><?xml version="1.0" encoding="utf-8"?>
+<w:endnotes xmlns:wpc="http://schemas.microsoft.com/office/word/2010/wordprocessingCanvas" xmlns:cx="http://schemas.microsoft.com/office/drawing/2014/chartex" xmlns:cx1="http://schemas.microsoft.com/office/drawing/2015/9/8/chartex" xmlns:cx2="http://schemas.microsoft.com/office/drawing/2015/10/21/chartex" xmlns:cx3="http://schemas.microsoft.com/office/drawing/2016/5/9/chartex" xmlns:cx4="http://schemas.microsoft.com/office/drawing/2016/5/10/chartex" xmlns:cx5="http://schemas.microsoft.com/office/drawing/2016/5/11/chartex" xmlns:cx6="http://schemas.microsoft.com/office/drawing/2016/5/12/chartex" xmlns:cx7="http://schemas.microsoft.com/office/drawing/2016/5/13/chartex" xmlns:cx8="http://schemas.microsoft.com/office/drawing/2016/5/14/chartex" xmlns:mc="http://schemas.openxmlformats.org/markup-compatibility/2006" xmlns:aink="http://schemas.microsoft.com/office/drawing/2016/ink" xmlns:am3d="http://schemas.microsoft.com/office/drawing/2017/model3d" xmlns:o="urn:schemas-microsoft-com:office:office" xmlns:oel="http://schemas.microsoft.com/office/2019/extlst" xmlns:r="http://schemas.openxmlformats.org/officeDocument/2006/relationships" xmlns:m="http://schemas.openxmlformats.org/officeDocument/2006/math" xmlns:v="urn:schemas-microsoft-com:vml" xmlns:wp14="http://schemas.microsoft.com/office/word/2010/wordprocessingDrawing" xmlns:wp="http://schemas.openxmlformats.org/drawingml/2006/wordprocessingDrawing" xmlns:w10="urn:schemas-microsoft-com:office:word" xmlns:w="http://schemas.openxmlformats.org/wordprocessingml/2006/main" xmlns:w14="http://schemas.microsoft.com/office/word/2010/wordml" xmlns:w15="http://schemas.microsoft.com/office/word/2012/wordml" xmlns:w16cex="http://schemas.microsoft.com/office/word/2018/wordml/cex" xmlns:w16cid="http://schemas.microsoft.com/office/word/2016/wordml/cid" xmlns:w16="http://schemas.microsoft.com/office/word/2018/wordml" xmlns:w16du="http://schemas.microsoft.com/office/word/2023/wordml/word16du" xmlns:w16sdtdh="http://schemas.microsoft.com/office/word/2020/wordml/sdtdatahash" xmlns:w16sdtfl="http://schemas.microsoft.com/office/word/2024/wordml/sdtformatlock" xmlns:w16se="http://schemas.microsoft.com/office/word/2015/wordml/symex" xmlns:wpg="http://schemas.microsoft.com/office/word/2010/wordprocessingGroup" xmlns:wpi="http://schemas.microsoft.com/office/word/2010/wordprocessingInk" xmlns:wne="http://schemas.microsoft.com/office/word/2006/wordml" xmlns:wps="http://schemas.microsoft.com/office/word/2010/wordprocessingShape" mc:Ignorable="w14 w15 w16se w16cid w16 w16cex w16sdtdh w16sdtfl w16du wp14">
+  <w:endnote w:type="separator" w:id="-1">
+    <w:p>
+      <w:r>
+        <w:separator/>
+      </w:r>
+    </w:p>
+  </w:endnote>
+  <w:endnote w:type="continuationSeparator" w:id="0">
+    <w:p>
+      <w:r>
+        <w:continuationSeparator/>
+      </w:r>
+    </w:p>
+  </w:endnote>
+</w:endnotes>
+</file>
+
 <file path=word/footer1.xml><?xml version="1.0" encoding="utf-8"?>
-<w:ftr xmlns:wpc="http://schemas.microsoft.com/office/word/2010/wordprocessingCanvas" xmlns:cx="http://schemas.microsoft.com/office/drawing/2014/chartex" xmlns:cx1="http://schemas.microsoft.com/office/drawing/2015/9/8/chartex" xmlns:cx2="http://schemas.microsoft.com/office/drawing/2015/10/21/chartex" xmlns:cx3="http://schemas.microsoft.com/office/drawing/2016/5/9/chartex" xmlns:cx4="http://schemas.microsoft.com/office/drawing/2016/5/10/chartex" xmlns:cx5="http://schemas.microsoft.com/office/drawing/2016/5/11/chartex" xmlns:cx6="http://schemas.microsoft.com/office/drawing/2016/5/12/chartex" xmlns:cx7="http://schemas.microsoft.com/office/drawing/2016/5/13/chartex" xmlns:cx8="http://schemas.microsoft.com/office/drawing/2016/5/14/chartex" xmlns:mc="http://schemas.openxmlformats.org/markup-compatibility/2006" xmlns:aink="http://schemas.microsoft.com/office/drawing/2016/ink" xmlns:am3d="http://schemas.microsoft.com/office/drawing/2017/model3d" xmlns:o="urn:schemas-microsoft-com:office:office" xmlns:oel="http://schemas.microsoft.com/office/2019/extlst" xmlns:r="http://schemas.openxmlformats.org/officeDocument/2006/relationships" xmlns:m="http://schemas.openxmlformats.org/officeDocument/2006/math" xmlns:v="urn:schemas-microsoft-com:vml" xmlns:wp14="http://schemas.microsoft.com/office/word/2010/wordprocessingDrawing" xmlns:wp="http://schemas.openxmlformats.org/drawingml/2006/wordprocessingDrawing" xmlns:w10="urn:schemas-microsoft-com:office:word" xmlns:w="http://schemas.openxmlformats.org/wordprocessingml/2006/main" xmlns:w14="http://schemas.microsoft.com/office/word/2010/wordml" xmlns:w15="http://schemas.microsoft.com/office/word/2012/wordml" xmlns:w16cei="http://schemas.microsoft.com/office/word/2026/wordml/cei" xmlns:w16cex="http://schemas.microsoft.com/office/word/2018/wordml/cex" xmlns:w16cid="http://schemas.microsoft.com/office/word/2016/wordml/cid" xmlns:w16="http://schemas.microsoft.com/office/word/2018/wordml" xmlns:w16du="http://schemas.microsoft.com/office/word/2023/wordml/word16du" xmlns:w16sdtdh="http://schemas.microsoft.com/office/word/2020/wordml/sdtdatahash" xmlns:w16sdtfl="http://schemas.microsoft.com/office/word/2024/wordml/sdtformatlock" xmlns:w16se="http://schemas.microsoft.com/office/word/2015/wordml/symex" xmlns:wpg="http://schemas.microsoft.com/office/word/2010/wordprocessingGroup" xmlns:wpi="http://schemas.microsoft.com/office/word/2010/wordprocessingInk" xmlns:wne="http://schemas.microsoft.com/office/word/2006/wordml" xmlns:wps="http://schemas.microsoft.com/office/word/2010/wordprocessingShape" mc:Ignorable="w14 w15 w16se w16cid w16 w16cex w16sdtdh w16sdtfl w16du wp14">
+<w:ftr xmlns:wpc="http://schemas.microsoft.com/office/word/2010/wordprocessingCanvas" xmlns:cx="http://schemas.microsoft.com/office/drawing/2014/chartex" xmlns:cx1="http://schemas.microsoft.com/office/drawing/2015/9/8/chartex" xmlns:cx2="http://schemas.microsoft.com/office/drawing/2015/10/21/chartex" xmlns:cx3="http://schemas.microsoft.com/office/drawing/2016/5/9/chartex" xmlns:cx4="http://schemas.microsoft.com/office/drawing/2016/5/10/chartex" xmlns:cx5="http://schemas.microsoft.com/office/drawing/2016/5/11/chartex" xmlns:cx6="http://schemas.microsoft.com/office/drawing/2016/5/12/chartex" xmlns:cx7="http://schemas.microsoft.com/office/drawing/2016/5/13/chartex" xmlns:cx8="http://schemas.microsoft.com/office/drawing/2016/5/14/chartex" xmlns:mc="http://schemas.openxmlformats.org/markup-compatibility/2006" xmlns:aink="http://schemas.microsoft.com/office/drawing/2016/ink" xmlns:am3d="http://schemas.microsoft.com/office/drawing/2017/model3d" xmlns:o="urn:schemas-microsoft-com:office:office" xmlns:oel="http://schemas.microsoft.com/office/2019/extlst" xmlns:r="http://schemas.openxmlformats.org/officeDocument/2006/relationships" xmlns:m="http://schemas.openxmlformats.org/officeDocument/2006/math" xmlns:v="urn:schemas-microsoft-com:vml" xmlns:wp14="http://schemas.microsoft.com/office/word/2010/wordprocessingDrawing" xmlns:wp="http://schemas.openxmlformats.org/drawingml/2006/wordprocessingDrawing" xmlns:w10="urn:schemas-microsoft-com:office:word" xmlns:w="http://schemas.openxmlformats.org/wordprocessingml/2006/main" xmlns:w14="http://schemas.microsoft.com/office/word/2010/wordml" xmlns:w15="http://schemas.microsoft.com/office/word/2012/wordml" xmlns:w16cex="http://schemas.microsoft.com/office/word/2018/wordml/cex" xmlns:w16cid="http://schemas.microsoft.com/office/word/2016/wordml/cid" xmlns:w16="http://schemas.microsoft.com/office/word/2018/wordml" xmlns:w16du="http://schemas.microsoft.com/office/word/2023/wordml/word16du" xmlns:w16sdtdh="http://schemas.microsoft.com/office/word/2020/wordml/sdtdatahash" xmlns:w16sdtfl="http://schemas.microsoft.com/office/word/2024/wordml/sdtformatlock" xmlns:w16se="http://schemas.microsoft.com/office/word/2015/wordml/symex" xmlns:wpg="http://schemas.microsoft.com/office/word/2010/wordprocessingGroup" xmlns:wpi="http://schemas.microsoft.com/office/word/2010/wordprocessingInk" xmlns:wne="http://schemas.microsoft.com/office/word/2006/wordml" xmlns:wps="http://schemas.microsoft.com/office/word/2010/wordprocessingShape" mc:Ignorable="w14 w15 w16se w16cid w16 w16cex w16sdtdh w16sdtfl w16du wp14">
   <w:sdt>
     <w:sdtPr>
       <w:id w:val="1214389295"/>
@@ -4891,6 +4918,25 @@
     </w:pPr>
   </w:p>
 </w:ftr>
+</file>
+
+<file path=word/footnotes.xml><?xml version="1.0" encoding="utf-8"?>
+<w:footnotes xmlns:wpc="http://schemas.microsoft.com/office/word/2010/wordprocessingCanvas" xmlns:cx="http://schemas.microsoft.com/office/drawing/2014/chartex" xmlns:cx1="http://schemas.microsoft.com/office/drawing/2015/9/8/chartex" xmlns:cx2="http://schemas.microsoft.com/office/drawing/2015/10/21/chartex" xmlns:cx3="http://schemas.microsoft.com/office/drawing/2016/5/9/chartex" xmlns:cx4="http://schemas.microsoft.com/office/drawing/2016/5/10/chartex" xmlns:cx5="http://schemas.microsoft.com/office/drawing/2016/5/11/chartex" xmlns:cx6="http://schemas.microsoft.com/office/drawing/2016/5/12/chartex" xmlns:cx7="http://schemas.microsoft.com/office/drawing/2016/5/13/chartex" xmlns:cx8="http://schemas.microsoft.com/office/drawing/2016/5/14/chartex" xmlns:mc="http://schemas.openxmlformats.org/markup-compatibility/2006" xmlns:aink="http://schemas.microsoft.com/office/drawing/2016/ink" xmlns:am3d="http://schemas.microsoft.com/office/drawing/2017/model3d" xmlns:o="urn:schemas-microsoft-com:office:office" xmlns:oel="http://schemas.microsoft.com/office/2019/extlst" xmlns:r="http://schemas.openxmlformats.org/officeDocument/2006/relationships" xmlns:m="http://schemas.openxmlformats.org/officeDocument/2006/math" xmlns:v="urn:schemas-microsoft-com:vml" xmlns:wp14="http://schemas.microsoft.com/office/word/2010/wordprocessingDrawing" xmlns:wp="http://schemas.openxmlformats.org/drawingml/2006/wordprocessingDrawing" xmlns:w10="urn:schemas-microsoft-com:office:word" xmlns:w="http://schemas.openxmlformats.org/wordprocessingml/2006/main" xmlns:w14="http://schemas.microsoft.com/office/word/2010/wordml" xmlns:w15="http://schemas.microsoft.com/office/word/2012/wordml" xmlns:w16cex="http://schemas.microsoft.com/office/word/2018/wordml/cex" xmlns:w16cid="http://schemas.microsoft.com/office/word/2016/wordml/cid" xmlns:w16="http://schemas.microsoft.com/office/word/2018/wordml" xmlns:w16du="http://schemas.microsoft.com/office/word/2023/wordml/word16du" xmlns:w16sdtdh="http://schemas.microsoft.com/office/word/2020/wordml/sdtdatahash" xmlns:w16sdtfl="http://schemas.microsoft.com/office/word/2024/wordml/sdtformatlock" xmlns:w16se="http://schemas.microsoft.com/office/word/2015/wordml/symex" xmlns:wpg="http://schemas.microsoft.com/office/word/2010/wordprocessingGroup" xmlns:wpi="http://schemas.microsoft.com/office/word/2010/wordprocessingInk" xmlns:wne="http://schemas.microsoft.com/office/word/2006/wordml" xmlns:wps="http://schemas.microsoft.com/office/word/2010/wordprocessingShape" mc:Ignorable="w14 w15 w16se w16cid w16 w16cex w16sdtdh w16sdtfl w16du wp14">
+  <w:footnote w:type="separator" w:id="-1">
+    <w:p>
+      <w:r>
+        <w:separator/>
+      </w:r>
+    </w:p>
+  </w:footnote>
+  <w:footnote w:type="continuationSeparator" w:id="0">
+    <w:p>
+      <w:r>
+        <w:continuationSeparator/>
+      </w:r>
+    </w:p>
+  </w:footnote>
+</w:footnotes>
 </file>
 
 <file path=word/styles.xml><?xml version="1.0" encoding="utf-8"?>

</xml_diff>

<commit_message>
Update to new version
Version with our logo
</commit_message>
<xml_diff>
--- a/handout 3 - actionable checklist.docx
+++ b/handout 3 - actionable checklist.docx
@@ -2728,17 +2728,6 @@
         </w:rPr>
         <w:t xml:space="preserve"> values or categories have an explanation </w:t>
       </w:r>
-    </w:p>
-    <w:p>
-      <w:pPr>
-        <w:spacing w:after="60"/>
-        <w:ind w:left="346" w:hanging="346"/>
-        <w:rPr>
-          <w:color w:val="1A1A1A"/>
-          <w:sz w:val="24"/>
-          <w:szCs w:val="24"/>
-        </w:rPr>
-      </w:pPr>
     </w:p>
     <w:p>
       <w:pPr>
@@ -4838,9 +4827,10 @@
     </w:p>
     <w:p/>
     <w:sectPr>
-      <w:footerReference w:type="default" r:id="rId6"/>
+      <w:headerReference w:type="default" r:id="rId6"/>
+      <w:footerReference w:type="default" r:id="rId7"/>
       <w:pgSz w:w="12240" w:h="15840"/>
-      <w:pgMar w:top="720" w:right="720" w:bottom="720" w:left="720" w:header="708" w:footer="708" w:gutter="0"/>
+      <w:pgMar w:top="1120" w:right="720" w:bottom="720" w:left="720" w:header="302" w:footer="708" w:gutter="0"/>
       <w:cols w:space="720"/>
       <w:docGrid w:linePitch="360"/>
     </w:sectPr>
@@ -4937,6 +4927,127 @@
     </w:p>
   </w:footnote>
 </w:footnotes>
+</file>
+
+<file path=word/header1.xml><?xml version="1.0" encoding="utf-8"?>
+<w:hdr xmlns:wpc="http://schemas.microsoft.com/office/word/2010/wordprocessingCanvas" xmlns:cx="http://schemas.microsoft.com/office/drawing/2014/chartex" xmlns:cx1="http://schemas.microsoft.com/office/drawing/2015/9/8/chartex" xmlns:cx2="http://schemas.microsoft.com/office/drawing/2015/10/21/chartex" xmlns:cx3="http://schemas.microsoft.com/office/drawing/2016/5/9/chartex" xmlns:cx4="http://schemas.microsoft.com/office/drawing/2016/5/10/chartex" xmlns:cx5="http://schemas.microsoft.com/office/drawing/2016/5/11/chartex" xmlns:cx6="http://schemas.microsoft.com/office/drawing/2016/5/12/chartex" xmlns:cx7="http://schemas.microsoft.com/office/drawing/2016/5/13/chartex" xmlns:cx8="http://schemas.microsoft.com/office/drawing/2016/5/14/chartex" xmlns:mc="http://schemas.openxmlformats.org/markup-compatibility/2006" xmlns:aink="http://schemas.microsoft.com/office/drawing/2016/ink" xmlns:am3d="http://schemas.microsoft.com/office/drawing/2017/model3d" xmlns:o="urn:schemas-microsoft-com:office:office" xmlns:oel="http://schemas.microsoft.com/office/2019/extlst" xmlns:r="http://schemas.openxmlformats.org/officeDocument/2006/relationships" xmlns:m="http://schemas.openxmlformats.org/officeDocument/2006/math" xmlns:v="urn:schemas-microsoft-com:vml" xmlns:wp14="http://schemas.microsoft.com/office/word/2010/wordprocessingDrawing" xmlns:wp="http://schemas.openxmlformats.org/drawingml/2006/wordprocessingDrawing" xmlns:w10="urn:schemas-microsoft-com:office:word" xmlns:w="http://schemas.openxmlformats.org/wordprocessingml/2006/main" xmlns:w14="http://schemas.microsoft.com/office/word/2010/wordml" xmlns:w15="http://schemas.microsoft.com/office/word/2012/wordml" xmlns:w16cex="http://schemas.microsoft.com/office/word/2018/wordml/cex" xmlns:w16cid="http://schemas.microsoft.com/office/word/2016/wordml/cid" xmlns:w16="http://schemas.microsoft.com/office/word/2018/wordml" xmlns:w16du="http://schemas.microsoft.com/office/word/2023/wordml/word16du" xmlns:w16sdtdh="http://schemas.microsoft.com/office/word/2020/wordml/sdtdatahash" xmlns:w16sdtfl="http://schemas.microsoft.com/office/word/2024/wordml/sdtformatlock" xmlns:w16se="http://schemas.microsoft.com/office/word/2015/wordml/symex" xmlns:wpg="http://schemas.microsoft.com/office/word/2010/wordprocessingGroup" xmlns:wpi="http://schemas.microsoft.com/office/word/2010/wordprocessingInk" xmlns:wne="http://schemas.microsoft.com/office/word/2006/wordml" xmlns:wps="http://schemas.microsoft.com/office/word/2010/wordprocessingShape" mc:Ignorable="w14 w15 w16se w16cid w16 w16cex w16sdtdh w16sdtfl w16du wp14">
+  <w:tbl>
+    <w:tblPr>
+      <w:tblW w:w="10800" w:type="dxa"/>
+      <w:tblBorders>
+        <w:bottom w:val="single" w:sz="6" w:space="0" w:color="1F4E79"/>
+      </w:tblBorders>
+      <w:tblCellMar>
+        <w:left w:w="0" w:type="dxa"/>
+        <w:bottom w:w="60" w:type="dxa"/>
+        <w:right w:w="0" w:type="dxa"/>
+      </w:tblCellMar>
+      <w:tblLook w:val="0000" w:firstRow="0" w:lastRow="0" w:firstColumn="0" w:lastColumn="0" w:noHBand="0" w:noVBand="0"/>
+    </w:tblPr>
+    <w:tblGrid>
+      <w:gridCol w:w="9910"/>
+      <w:gridCol w:w="890"/>
+    </w:tblGrid>
+    <w:tr>
+      <w:tc>
+        <w:tcPr>
+          <w:tcW w:w="9910" w:type="dxa"/>
+          <w:vAlign w:val="center"/>
+        </w:tcPr>
+        <w:p>
+          <w:pPr>
+            <w:spacing w:after="10"/>
+            <w:jc w:val="right"/>
+          </w:pPr>
+          <w:r>
+            <w:rPr>
+              <w:b/>
+              <w:color w:val="1F4E79"/>
+              <w:spacing w:val="34"/>
+              <w:sz w:val="16"/>
+              <w:szCs w:val="16"/>
+            </w:rPr>
+            <w:t>SUPERIOR COURT OF CALIFORNIA</w:t>
+          </w:r>
+        </w:p>
+        <w:p>
+          <w:pPr>
+            <w:jc w:val="right"/>
+          </w:pPr>
+          <w:r>
+            <w:rPr>
+              <w:color w:val="6A6A6A"/>
+              <w:spacing w:val="28"/>
+              <w:sz w:val="15"/>
+              <w:szCs w:val="15"/>
+            </w:rPr>
+            <w:t>COUNTY OF SAN BERNARDINO</w:t>
+          </w:r>
+        </w:p>
+      </w:tc>
+      <w:tc>
+        <w:tcPr>
+          <w:tcW w:w="890" w:type="dxa"/>
+          <w:vAlign w:val="center"/>
+        </w:tcPr>
+        <w:p>
+          <w:pPr>
+            <w:ind w:left="170"/>
+            <w:jc w:val="right"/>
+          </w:pPr>
+          <w:r>
+            <w:rPr>
+              <w:noProof/>
+            </w:rPr>
+            <w:drawing>
+              <wp:inline distT="0" distB="0" distL="0" distR="0" wp14:anchorId="0010267B" wp14:editId="06A0E30D">
+                <wp:extent cx="457200" cy="457200"/>
+                <wp:effectExtent l="0" t="0" r="0" b="0"/>
+                <wp:docPr id="903" name="Court Seal" descr="Seal of the Superior Court of California, County of San Bernardino"/>
+                <wp:cNvGraphicFramePr>
+                  <a:graphicFrameLocks xmlns:a="http://schemas.openxmlformats.org/drawingml/2006/main" noChangeAspect="1"/>
+                </wp:cNvGraphicFramePr>
+                <a:graphic xmlns:a="http://schemas.openxmlformats.org/drawingml/2006/main">
+                  <a:graphicData uri="http://schemas.openxmlformats.org/drawingml/2006/picture">
+                    <pic:pic xmlns:pic="http://schemas.openxmlformats.org/drawingml/2006/picture">
+                      <pic:nvPicPr>
+                        <pic:cNvPr id="903" name="Court Seal"/>
+                        <pic:cNvPicPr/>
+                      </pic:nvPicPr>
+                      <pic:blipFill>
+                        <a:blip r:embed="rId1"/>
+                        <a:stretch>
+                          <a:fillRect/>
+                        </a:stretch>
+                      </pic:blipFill>
+                      <pic:spPr>
+                        <a:xfrm>
+                          <a:off x="0" y="0"/>
+                          <a:ext cx="457200" cy="457200"/>
+                        </a:xfrm>
+                        <a:prstGeom prst="rect">
+                          <a:avLst/>
+                        </a:prstGeom>
+                      </pic:spPr>
+                    </pic:pic>
+                  </a:graphicData>
+                </a:graphic>
+              </wp:inline>
+            </w:drawing>
+          </w:r>
+        </w:p>
+      </w:tc>
+    </w:tr>
+  </w:tbl>
+  <w:p>
+    <w:pPr>
+      <w:rPr>
+        <w:sz w:val="4"/>
+        <w:szCs w:val="4"/>
+      </w:rPr>
+    </w:pPr>
+  </w:p>
+</w:hdr>
 </file>
 
 <file path=word/styles.xml><?xml version="1.0" encoding="utf-8"?>

</xml_diff>